<commit_message>
Update the 5-gene benchmark optimism-corrected C from 0.48 to 0.52 after re-running under R 4.5.3/rms 8.1-1 (0.48 was recorded under R 4.3.3/rms 6.8-1 per the committed sessionInfo); note the environment dependence in the manuscript and annotate all supporting documents; return 7 Results paragraphs that the figure split had misplaced into the figures document
</commit_message>
<xml_diff>
--- a/COVER_LETTER.docx
+++ b/COVER_LETTER.docx
@@ -73,7 +73,7 @@
           <w:b/>
           <w:bCs/>
         </w:rPr>
-        <w:t xml:space="preserve">“A multi-omics analysis of</w:t>
+        <w:t xml:space="preserve">"A multi-omics analysis of</w:t>
       </w:r>
       <w:r>
         <w:rPr>
@@ -115,7 +115,7 @@
           <w:b/>
           <w:bCs/>
         </w:rPr>
-        <w:t xml:space="preserve">assessments,”</w:t>
+        <w:t xml:space="preserve">assessments,"</w:t>
       </w:r>
       <w:r>
         <w:t xml:space="preserve"> </w:t>
@@ -141,19 +141,7 @@
         <w:t xml:space="preserve"> </w:t>
       </w:r>
       <w:r>
-        <w:t xml:space="preserve">microbiome</w:t>
-      </w:r>
-      <w:r>
-        <w:t xml:space="preserve"> </w:t>
-      </w:r>
-      <w:r>
-        <w:t xml:space="preserve">“dysbiosis”</w:t>
-      </w:r>
-      <w:r>
-        <w:t xml:space="preserve"> </w:t>
-      </w:r>
-      <w:r>
-        <w:t xml:space="preserve">claims that are reported on single cohorts without</w:t>
+        <w:t xml:space="preserve">microbiome "dysbiosis" claims that are reported on single cohorts without</w:t>
       </w:r>
       <w:r>
         <w:t xml:space="preserve"> </w:t>

</xml_diff>